<commit_message>
docs(radar): update phase 2 progress to 67 percent
</commit_message>
<xml_diff>
--- a/radar-mvp/output/docs/Informe_Avance_Radar_Fase2_2026-07-24.docx
+++ b/radar-mvp/output/docs/Informe_Avance_Radar_Fase2_2026-07-24.docx
@@ -95,7 +95,7 @@
                 <w:color w:val="FFFFFF"/>
                 <w:sz w:val="48"/>
               </w:rPr>
-              <w:t>60%</w:t>
+              <w:t>67%</w:t>
             </w:r>
           </w:p>
         </w:tc>
@@ -146,7 +146,7 @@
                 <w:color w:val="202124"/>
                 <w:sz w:val="20"/>
               </w:rPr>
-              <w:t>Fase 1 permanece en 84%. La Fase 2 comercial alcanza 60% con un recorrido funcional validado en local; pagos, correo entregado, canon observado e integraciones todavía requieren decisiones externas.</w:t>
+              <w:t>Fase 1 permanece en 84%. La Fase 2 comercial alcanza 67% con un recorrido funcional validado en local; pagos, correo entregado, canon observado e integraciones todavía requieren decisiones externas.</w:t>
             </w:r>
           </w:p>
         </w:tc>
@@ -460,7 +460,7 @@
                 <w:color w:val="202124"/>
                 <w:sz w:val="20"/>
               </w:rPr>
-              <w:t>6d84175</w:t>
+              <w:t>f606520</w:t>
             </w:r>
           </w:p>
         </w:tc>
@@ -672,7 +672,7 @@
           <w:color w:val="202124"/>
           <w:sz w:val="22"/>
         </w:rPr>
-        <w:t>Fase 2 comercial/expansión: planes, alertas, rentabilidad, comparador, administración, pagos e integraciones, aproximadamente 60%.</w:t>
+        <w:t>Fase 2 comercial/expansión: planes, alertas, rentabilidad, comparador, administración, pagos e integraciones, aproximadamente 67%.</w:t>
       </w:r>
     </w:p>
     <w:tbl>
@@ -960,7 +960,7 @@
           <w:color w:val="202124"/>
           <w:sz w:val="22"/>
         </w:rPr>
-        <w:t>Validación de ciudad, presupuesto, tipo, frecuencia y estado.</w:t>
+        <w:t>Validación separada de entradas y alertas persistidas.</w:t>
       </w:r>
     </w:p>
     <w:p>
@@ -975,7 +975,7 @@
           <w:color w:val="202124"/>
           <w:sz w:val="22"/>
         </w:rPr>
-        <w:t>Procesamiento semanal, búsqueda de coincidencias y plantilla segura.</w:t>
+        <w:t>Historial de entrega, idempotencia y reintentos escalonados.</w:t>
       </w:r>
     </w:p>
     <w:p>
@@ -990,7 +990,7 @@
           <w:color w:val="202124"/>
           <w:sz w:val="22"/>
         </w:rPr>
-        <w:t>Adaptador Resend y endpoint interno protegido.</w:t>
+        <w:t>Adaptador Resend y proceso semanal protegido.</w:t>
       </w:r>
     </w:p>
     <w:p>
@@ -1058,7 +1058,7 @@
           <w:color w:val="202124"/>
           <w:sz w:val="22"/>
         </w:rPr>
-        <w:t>Separación explícita entre canon declarado y canon observado.</w:t>
+        <w:t>Exportación CSV y separación entre canon declarado y observado.</w:t>
       </w:r>
     </w:p>
     <w:p>
@@ -1096,7 +1096,7 @@
           <w:color w:val="202124"/>
           <w:sz w:val="22"/>
         </w:rPr>
-        <w:t>Usuarios, Pro, solicitudes, alertas y perfiles completos.</w:t>
+        <w:t>Usuarios, embudo Pro, alertas, perfiles y estado de entregas.</w:t>
       </w:r>
     </w:p>
     <w:p>
@@ -1396,7 +1396,7 @@
                 <w:color w:val="202124"/>
                 <w:sz w:val="17"/>
               </w:rPr>
-              <w:t>85%</w:t>
+              <w:t>90%</w:t>
             </w:r>
           </w:p>
         </w:tc>
@@ -1432,7 +1432,7 @@
                 <w:color w:val="202124"/>
                 <w:sz w:val="17"/>
               </w:rPr>
-              <w:t>12,8</w:t>
+              <w:t>13,5</w:t>
             </w:r>
           </w:p>
         </w:tc>
@@ -1690,7 +1690,7 @@
                 <w:color w:val="202124"/>
                 <w:sz w:val="17"/>
               </w:rPr>
-              <w:t>70%</w:t>
+              <w:t>85%</w:t>
             </w:r>
           </w:p>
         </w:tc>
@@ -1726,7 +1726,7 @@
                 <w:color w:val="202124"/>
                 <w:sz w:val="17"/>
               </w:rPr>
-              <w:t>14,0</w:t>
+              <w:t>17,0</w:t>
             </w:r>
           </w:p>
         </w:tc>
@@ -1837,7 +1837,7 @@
                 <w:color w:val="202124"/>
                 <w:sz w:val="17"/>
               </w:rPr>
-              <w:t>75%</w:t>
+              <w:t>85%</w:t>
             </w:r>
           </w:p>
         </w:tc>
@@ -1873,7 +1873,7 @@
                 <w:color w:val="202124"/>
                 <w:sz w:val="17"/>
               </w:rPr>
-              <w:t>11,3</w:t>
+              <w:t>12,8</w:t>
             </w:r>
           </w:p>
         </w:tc>
@@ -2131,7 +2131,7 @@
                 <w:color w:val="202124"/>
                 <w:sz w:val="17"/>
               </w:rPr>
-              <w:t>60%</w:t>
+              <w:t>75%</w:t>
             </w:r>
           </w:p>
         </w:tc>
@@ -2167,7 +2167,7 @@
                 <w:color w:val="202124"/>
                 <w:sz w:val="17"/>
               </w:rPr>
-              <w:t>6,0</w:t>
+              <w:t>7,5</w:t>
             </w:r>
           </w:p>
         </w:tc>
@@ -2460,7 +2460,7 @@
                 <w:color w:val="202124"/>
                 <w:sz w:val="17"/>
               </w:rPr>
-              <w:t>60,0%</w:t>
+              <w:t>66,8% ≈ 67%</w:t>
             </w:r>
           </w:p>
         </w:tc>
@@ -2725,7 +2725,7 @@
                 <w:color w:val="202124"/>
                 <w:sz w:val="18"/>
               </w:rPr>
-              <w:t>86/86</w:t>
+              <w:t>94/94</w:t>
             </w:r>
           </w:p>
         </w:tc>
@@ -4120,6 +4120,36 @@
           <w:color w:val="202124"/>
           <w:sz w:val="22"/>
         </w:rPr>
+        <w:t>Idempotencia de proveedor, historial y reintentos.</w:t>
+      </w:r>
+    </w:p>
+    <w:p>
+      <w:pPr>
+        <w:pStyle w:val="ListBullet"/>
+      </w:pPr>
+      <w:r>
+        <w:rPr>
+          <w:rFonts w:ascii="Calibri" w:hAnsi="Calibri"/>
+          <w:b w:val="0"/>
+          <w:i w:val="0"/>
+          <w:color w:val="202124"/>
+          <w:sz w:val="22"/>
+        </w:rPr>
+        <w:t>Límites de abuso para endpoints sensibles.</w:t>
+      </w:r>
+    </w:p>
+    <w:p>
+      <w:pPr>
+        <w:pStyle w:val="ListBullet"/>
+      </w:pPr>
+      <w:r>
+        <w:rPr>
+          <w:rFonts w:ascii="Calibri" w:hAnsi="Calibri"/>
+          <w:b w:val="0"/>
+          <w:i w:val="0"/>
+          <w:color w:val="202124"/>
+          <w:sz w:val="22"/>
+        </w:rPr>
         <w:t>Proceso interno cerrado si falta secreto o proveedor.</w:t>
       </w:r>
     </w:p>
@@ -4148,7 +4178,7 @@
         <w:pStyle w:val="Heading1"/>
       </w:pPr>
       <w:r>
-        <w:t>5. Ruta de 60% a 80%</w:t>
+        <w:t>5. Ruta de 67% a 80%</w:t>
       </w:r>
     </w:p>
     <w:p>
@@ -4201,7 +4231,7 @@
           <w:color w:val="202124"/>
           <w:sz w:val="22"/>
         </w:rPr>
-        <w:t>Ejecutar envío controlado y registrar historial, deduplicación y reintentos.</w:t>
+        <w:t>Ejecutar un envío controlado y verificar historial, deduplicación y reintentos.</w:t>
       </w:r>
     </w:p>
     <w:p>
@@ -5780,7 +5810,7 @@
                 <w:color w:val="202124"/>
                 <w:sz w:val="18"/>
               </w:rPr>
-              <w:t>Rate limiting para auth, IA y procesos</w:t>
+              <w:t>Contadores compartidos al operar varias réplicas</w:t>
             </w:r>
           </w:p>
         </w:tc>
@@ -6316,7 +6346,7 @@
                 <w:color w:val="202124"/>
                 <w:sz w:val="20"/>
               </w:rPr>
-              <w:t>“La Fase 1 ya superó el 80%. En Fase 2 no estamos mostrando maquetas: ya existen planes, cuenta, alertas, comparador y rentabilidad. Lo pendiente son decisiones y servicios externos que no debemos fingir.”</w:t>
+              <w:t>“La Fase 1 ya superó el 80%. En Fase 2 ya existen planes, cuenta, alertas trazables, comparador, exportación y rentabilidad. Lo pendiente son decisiones y servicios externos que no debemos fingir.”</w:t>
             </w:r>
           </w:p>
         </w:tc>

</xml_diff>

<commit_message>
docs(radar): update phase 2 progress to 71 percent
</commit_message>
<xml_diff>
--- a/radar-mvp/output/docs/Informe_Avance_Radar_Fase2_2026-07-24.docx
+++ b/radar-mvp/output/docs/Informe_Avance_Radar_Fase2_2026-07-24.docx
@@ -95,7 +95,7 @@
                 <w:color w:val="FFFFFF"/>
                 <w:sz w:val="48"/>
               </w:rPr>
-              <w:t>67%</w:t>
+              <w:t>71%</w:t>
             </w:r>
           </w:p>
         </w:tc>
@@ -146,7 +146,7 @@
                 <w:color w:val="202124"/>
                 <w:sz w:val="20"/>
               </w:rPr>
-              <w:t>Fase 1 permanece en 84%. La Fase 2 comercial alcanza 67% con un recorrido funcional validado en local; pagos, correo entregado, canon observado e integraciones todavía requieren decisiones externas.</w:t>
+              <w:t>Fase 1 permanece en 84%. La Fase 2 comercial alcanza 71% con un recorrido funcional validado en local; pagos, correo entregado, canon observado e integraciones todavía requieren decisiones externas.</w:t>
             </w:r>
           </w:p>
         </w:tc>
@@ -460,7 +460,7 @@
                 <w:color w:val="202124"/>
                 <w:sz w:val="20"/>
               </w:rPr>
-              <w:t>f606520</w:t>
+              <w:t>cc6c0e0</w:t>
             </w:r>
           </w:p>
         </w:tc>
@@ -672,7 +672,7 @@
           <w:color w:val="202124"/>
           <w:sz w:val="22"/>
         </w:rPr>
-        <w:t>Fase 2 comercial/expansión: planes, alertas, rentabilidad, comparador, administración, pagos e integraciones, aproximadamente 67%.</w:t>
+        <w:t>Fase 2 comercial/expansión: planes, alertas, rentabilidad, comparador, administración, pagos e integraciones, aproximadamente 71%.</w:t>
       </w:r>
     </w:p>
     <w:tbl>
@@ -922,6 +922,21 @@
           <w:color w:val="202124"/>
           <w:sz w:val="22"/>
         </w:rPr>
+        <w:t>Estados de prueba, activo, pago pendiente y cancelado con permisos efectivos.</w:t>
+      </w:r>
+    </w:p>
+    <w:p>
+      <w:pPr>
+        <w:pStyle w:val="ListBullet"/>
+      </w:pPr>
+      <w:r>
+        <w:rPr>
+          <w:rFonts w:ascii="Calibri" w:hAnsi="Calibri"/>
+          <w:b w:val="0"/>
+          <w:i w:val="0"/>
+          <w:color w:val="202124"/>
+          <w:sz w:val="22"/>
+        </w:rPr>
         <w:t>Una alerta para Free y hasta cinco para Pro.</w:t>
       </w:r>
     </w:p>
@@ -1097,6 +1112,21 @@
           <w:sz w:val="22"/>
         </w:rPr>
         <w:t>Usuarios, embudo Pro, alertas, perfiles y estado de entregas.</w:t>
+      </w:r>
+    </w:p>
+    <w:p>
+      <w:pPr>
+        <w:pStyle w:val="ListBullet"/>
+      </w:pPr>
+      <w:r>
+        <w:rPr>
+          <w:rFonts w:ascii="Calibri" w:hAnsi="Calibri"/>
+          <w:b w:val="0"/>
+          <w:i w:val="0"/>
+          <w:color w:val="202124"/>
+          <w:sz w:val="22"/>
+        </w:rPr>
+        <w:t>Cola de solicitudes, cambios de estado con motivo e historial auditable.</w:t>
       </w:r>
     </w:p>
     <w:p>
@@ -1543,7 +1573,7 @@
                 <w:color w:val="202124"/>
                 <w:sz w:val="17"/>
               </w:rPr>
-              <w:t>65%</w:t>
+              <w:t>80%</w:t>
             </w:r>
           </w:p>
         </w:tc>
@@ -1579,7 +1609,7 @@
                 <w:color w:val="202124"/>
                 <w:sz w:val="17"/>
               </w:rPr>
-              <w:t>9,8</w:t>
+              <w:t>12,0</w:t>
             </w:r>
           </w:p>
         </w:tc>
@@ -2131,7 +2161,7 @@
                 <w:color w:val="202124"/>
                 <w:sz w:val="17"/>
               </w:rPr>
-              <w:t>75%</w:t>
+              <w:t>90%</w:t>
             </w:r>
           </w:p>
         </w:tc>
@@ -2167,7 +2197,7 @@
                 <w:color w:val="202124"/>
                 <w:sz w:val="17"/>
               </w:rPr>
-              <w:t>7,5</w:t>
+              <w:t>9,0</w:t>
             </w:r>
           </w:p>
         </w:tc>
@@ -2460,7 +2490,7 @@
                 <w:color w:val="202124"/>
                 <w:sz w:val="17"/>
               </w:rPr>
-              <w:t>66,8% ≈ 67%</w:t>
+              <w:t>70,6% ≈ 71%</w:t>
             </w:r>
           </w:p>
         </w:tc>
@@ -2725,7 +2755,7 @@
                 <w:color w:val="202124"/>
                 <w:sz w:val="18"/>
               </w:rPr>
-              <w:t>94/94</w:t>
+              <w:t>97/97</w:t>
             </w:r>
           </w:p>
         </w:tc>
@@ -4178,7 +4208,7 @@
         <w:pStyle w:val="Heading1"/>
       </w:pPr>
       <w:r>
-        <w:t>5. Ruta de 67% a 80%</w:t>
+        <w:t>5. Ruta de 71% a 80%</w:t>
       </w:r>
     </w:p>
     <w:p>
@@ -4767,7 +4797,7 @@
                 <w:color w:val="202124"/>
                 <w:sz w:val="17"/>
               </w:rPr>
-              <w:t>No seleccionado</w:t>
+              <w:t>Estados listos; checkout pendiente</w:t>
             </w:r>
           </w:p>
         </w:tc>
@@ -6264,7 +6294,26 @@
           <w:color w:val="202124"/>
           <w:sz w:val="22"/>
         </w:rPr>
-        <w:t>Abrir /admin solo con una cuenta autorizada.</w:t>
+        <w:t>Abrir /admin y procesar una prueba sin presentarla como cobro.</w:t>
+      </w:r>
+    </w:p>
+    <w:p>
+      <w:pPr>
+        <w:pStyle w:val="ListNumber"/>
+        <w:numPr>
+          <w:ilvl w:val="0"/>
+          <w:numId w:val="10"/>
+        </w:numPr>
+      </w:pPr>
+      <w:r>
+        <w:rPr>
+          <w:rFonts w:ascii="Calibri" w:hAnsi="Calibri"/>
+          <w:b w:val="0"/>
+          <w:i w:val="0"/>
+          <w:color w:val="202124"/>
+          <w:sz w:val="22"/>
+        </w:rPr>
+        <w:t>Mostrar que pago pendiente pausa el acceso Pro.</w:t>
       </w:r>
     </w:p>
     <w:p>

</xml_diff>

<commit_message>
docs(radar): refresh phase 2 client report artifacts
</commit_message>
<xml_diff>
--- a/radar-mvp/output/docs/Informe_Avance_Radar_Fase2_2026-07-24.docx
+++ b/radar-mvp/output/docs/Informe_Avance_Radar_Fase2_2026-07-24.docx
@@ -95,7 +95,7 @@
                 <w:color w:val="FFFFFF"/>
                 <w:sz w:val="48"/>
               </w:rPr>
-              <w:t>71%</w:t>
+              <w:t>73%</w:t>
             </w:r>
           </w:p>
         </w:tc>
@@ -146,7 +146,7 @@
                 <w:color w:val="202124"/>
                 <w:sz w:val="20"/>
               </w:rPr>
-              <w:t>Fase 1 permanece en 84%. La Fase 2 comercial alcanza 71% con un recorrido funcional validado en local; pagos, correo entregado, canon observado e integraciones todavía requieren decisiones externas.</w:t>
+              <w:t>Fase 1 permanece en 84%. La Fase 2 comercial alcanza 73%: Resend, el dominio y ambos servicios están desplegados; pagos, canon observado y la activación del canary todavía requieren decisiones.</w:t>
             </w:r>
           </w:p>
         </w:tc>
@@ -312,7 +312,7 @@
                 <w:color w:val="202124"/>
                 <w:sz w:val="20"/>
               </w:rPr>
-              <w:t>24 de julio de 2026</w:t>
+              <w:t>25 de julio de 2026</w:t>
             </w:r>
           </w:p>
         </w:tc>
@@ -386,7 +386,7 @@
                 <w:color w:val="202124"/>
                 <w:sz w:val="20"/>
               </w:rPr>
-              <w:t>Listo para demostración local; no desplegado</w:t>
+              <w:t>Validado localmente y desplegado</w:t>
             </w:r>
           </w:p>
         </w:tc>
@@ -425,7 +425,7 @@
                 <w:color w:val="2E74B5"/>
                 <w:sz w:val="16"/>
               </w:rPr>
-              <w:t>VERSIÓN LOCAL</w:t>
+              <w:t>VERSIÓN DESPLEGADA</w:t>
             </w:r>
           </w:p>
         </w:tc>
@@ -460,7 +460,7 @@
                 <w:color w:val="202124"/>
                 <w:sz w:val="20"/>
               </w:rPr>
-              <w:t>cc6c0e0</w:t>
+              <w:t>PR #2 · b89770c</w:t>
             </w:r>
           </w:p>
         </w:tc>
@@ -672,7 +672,7 @@
           <w:color w:val="202124"/>
           <w:sz w:val="22"/>
         </w:rPr>
-        <w:t>Fase 2 comercial/expansión: planes, alertas, rentabilidad, comparador, administración, pagos e integraciones, aproximadamente 71%.</w:t>
+        <w:t>Fase 2 comercial/expansión: planes, alertas, rentabilidad, comparador, administración, pagos e integraciones, aproximadamente 73%.</w:t>
       </w:r>
     </w:p>
     <w:tbl>
@@ -735,7 +735,7 @@
                 <w:color w:val="202124"/>
                 <w:sz w:val="20"/>
               </w:rPr>
-              <w:t>El producto supera el 80% comprometido para Fase 1 y la Fase 2 comercial ya tiene un recorrido demostrable en local. Todavía no debe venderse como monetización o notificaciones plenamente operativas.</w:t>
+              <w:t>El producto supera el 80% comprometido para Fase 1. Resend ya está conectado y desplegado, pero todavía no debe venderse como monetización ni como automatización semanal activa.</w:t>
             </w:r>
           </w:p>
         </w:tc>
@@ -841,7 +841,7 @@
           <w:color w:val="202124"/>
           <w:sz w:val="22"/>
         </w:rPr>
-        <w:t>Degradación segura cuando correo o pagos no están configurados.</w:t>
+        <w:t>Resend conectado en producción, con automatización deshabilitada hasta el canary.</w:t>
       </w:r>
     </w:p>
     <w:p>
@@ -1005,7 +1005,7 @@
           <w:color w:val="202124"/>
           <w:sz w:val="22"/>
         </w:rPr>
-        <w:t>Adaptador Resend y proceso semanal protegido.</w:t>
+        <w:t>Resend desplegado y proceso semanal protegido, deshabilitado hasta el canary.</w:t>
       </w:r>
     </w:p>
     <w:p>
@@ -1720,7 +1720,7 @@
                 <w:color w:val="202124"/>
                 <w:sz w:val="17"/>
               </w:rPr>
-              <w:t>85%</w:t>
+              <w:t>97%</w:t>
             </w:r>
           </w:p>
         </w:tc>
@@ -1756,7 +1756,7 @@
                 <w:color w:val="202124"/>
                 <w:sz w:val="17"/>
               </w:rPr>
-              <w:t>17,0</w:t>
+              <w:t>19,4</w:t>
             </w:r>
           </w:p>
         </w:tc>
@@ -2490,7 +2490,7 @@
                 <w:color w:val="202124"/>
                 <w:sz w:val="17"/>
               </w:rPr>
-              <w:t>70,6% ≈ 71%</w:t>
+              <w:t>73,0% ≈ 73%</w:t>
             </w:r>
           </w:p>
         </w:tc>
@@ -2755,7 +2755,7 @@
                 <w:color w:val="202124"/>
                 <w:sz w:val="18"/>
               </w:rPr>
-              <w:t>97/97</w:t>
+              <w:t>98/98</w:t>
             </w:r>
           </w:p>
         </w:tc>
@@ -3131,6 +3131,156 @@
                 <w:sz w:val="18"/>
               </w:rPr>
               <w:t>0</w:t>
+            </w:r>
+          </w:p>
+        </w:tc>
+      </w:tr>
+      <w:tr>
+        <w:trPr/>
+        <w:tc>
+          <w:tcPr>
+            <w:tcW w:type="dxa" w:w="4800"/>
+            <w:shd w:fill="F5F7FA"/>
+            <w:tcBorders>
+              <w:top w:val="single" w:sz="4" w:color="DADCE0"/>
+              <w:left w:val="single" w:sz="4" w:color="DADCE0"/>
+              <w:bottom w:val="single" w:sz="4" w:color="DADCE0"/>
+              <w:right w:val="single" w:sz="4" w:color="DADCE0"/>
+              <w:insideH w:val="single" w:sz="4" w:color="DADCE0"/>
+              <w:insideV w:val="single" w:sz="4" w:color="DADCE0"/>
+            </w:tcBorders>
+            <w:vAlign w:val="center"/>
+            <w:tcMar>
+              <w:top w:type="dxa" w:w="80"/>
+              <w:bottom w:type="dxa" w:w="80"/>
+              <w:start w:type="dxa" w:w="120"/>
+              <w:end w:type="dxa" w:w="120"/>
+            </w:tcMar>
+          </w:tcPr>
+          <w:p>
+            <w:pPr>
+              <w:spacing w:after="0" w:line="240" w:lineRule="auto"/>
+            </w:pPr>
+            <w:r>
+              <w:rPr>
+                <w:rFonts w:ascii="Calibri" w:hAnsi="Calibri"/>
+                <w:b w:val="0"/>
+                <w:i w:val="0"/>
+                <w:color w:val="202124"/>
+                <w:sz w:val="18"/>
+              </w:rPr>
+              <w:t>Resend controlado</w:t>
+            </w:r>
+          </w:p>
+        </w:tc>
+        <w:tc>
+          <w:tcPr>
+            <w:tcW w:type="dxa" w:w="4560"/>
+            <w:shd w:fill="F5F7FA"/>
+            <w:tcBorders>
+              <w:top w:val="single" w:sz="4" w:color="DADCE0"/>
+              <w:left w:val="single" w:sz="4" w:color="DADCE0"/>
+              <w:bottom w:val="single" w:sz="4" w:color="DADCE0"/>
+              <w:right w:val="single" w:sz="4" w:color="DADCE0"/>
+              <w:insideH w:val="single" w:sz="4" w:color="DADCE0"/>
+              <w:insideV w:val="single" w:sz="4" w:color="DADCE0"/>
+            </w:tcBorders>
+            <w:vAlign w:val="center"/>
+            <w:tcMar>
+              <w:top w:type="dxa" w:w="80"/>
+              <w:bottom w:type="dxa" w:w="80"/>
+              <w:start w:type="dxa" w:w="120"/>
+              <w:end w:type="dxa" w:w="120"/>
+            </w:tcMar>
+          </w:tcPr>
+          <w:p>
+            <w:pPr>
+              <w:spacing w:after="0" w:line="240" w:lineRule="auto"/>
+            </w:pPr>
+            <w:r>
+              <w:rPr>
+                <w:rFonts w:ascii="Calibri" w:hAnsi="Calibri"/>
+                <w:b w:val="0"/>
+                <w:i w:val="0"/>
+                <w:color w:val="202124"/>
+                <w:sz w:val="18"/>
+              </w:rPr>
+              <w:t>Entregado</w:t>
+            </w:r>
+          </w:p>
+        </w:tc>
+      </w:tr>
+      <w:tr>
+        <w:trPr/>
+        <w:tc>
+          <w:tcPr>
+            <w:tcW w:type="dxa" w:w="4800"/>
+            <w:shd w:fill="FFFFFF"/>
+            <w:tcBorders>
+              <w:top w:val="single" w:sz="4" w:color="DADCE0"/>
+              <w:left w:val="single" w:sz="4" w:color="DADCE0"/>
+              <w:bottom w:val="single" w:sz="4" w:color="DADCE0"/>
+              <w:right w:val="single" w:sz="4" w:color="DADCE0"/>
+              <w:insideH w:val="single" w:sz="4" w:color="DADCE0"/>
+              <w:insideV w:val="single" w:sz="4" w:color="DADCE0"/>
+            </w:tcBorders>
+            <w:vAlign w:val="center"/>
+            <w:tcMar>
+              <w:top w:type="dxa" w:w="80"/>
+              <w:bottom w:type="dxa" w:w="80"/>
+              <w:start w:type="dxa" w:w="120"/>
+              <w:end w:type="dxa" w:w="120"/>
+            </w:tcMar>
+          </w:tcPr>
+          <w:p>
+            <w:pPr>
+              <w:spacing w:after="0" w:line="240" w:lineRule="auto"/>
+            </w:pPr>
+            <w:r>
+              <w:rPr>
+                <w:rFonts w:ascii="Calibri" w:hAnsi="Calibri"/>
+                <w:b w:val="0"/>
+                <w:i w:val="0"/>
+                <w:color w:val="202124"/>
+                <w:sz w:val="18"/>
+              </w:rPr>
+              <w:t>Producción</w:t>
+            </w:r>
+          </w:p>
+        </w:tc>
+        <w:tc>
+          <w:tcPr>
+            <w:tcW w:type="dxa" w:w="4560"/>
+            <w:shd w:fill="FFFFFF"/>
+            <w:tcBorders>
+              <w:top w:val="single" w:sz="4" w:color="DADCE0"/>
+              <w:left w:val="single" w:sz="4" w:color="DADCE0"/>
+              <w:bottom w:val="single" w:sz="4" w:color="DADCE0"/>
+              <w:right w:val="single" w:sz="4" w:color="DADCE0"/>
+              <w:insideH w:val="single" w:sz="4" w:color="DADCE0"/>
+              <w:insideV w:val="single" w:sz="4" w:color="DADCE0"/>
+            </w:tcBorders>
+            <w:vAlign w:val="center"/>
+            <w:tcMar>
+              <w:top w:type="dxa" w:w="80"/>
+              <w:bottom w:type="dxa" w:w="80"/>
+              <w:start w:type="dxa" w:w="120"/>
+              <w:end w:type="dxa" w:w="120"/>
+            </w:tcMar>
+          </w:tcPr>
+          <w:p>
+            <w:pPr>
+              <w:spacing w:after="0" w:line="240" w:lineRule="auto"/>
+            </w:pPr>
+            <w:r>
+              <w:rPr>
+                <w:rFonts w:ascii="Calibri" w:hAnsi="Calibri"/>
+                <w:b w:val="0"/>
+                <w:i w:val="0"/>
+                <w:color w:val="202124"/>
+                <w:sz w:val="18"/>
+              </w:rPr>
+              <w:t>Correo listo; cron deshabilitado</w:t>
             </w:r>
           </w:p>
         </w:tc>
@@ -3577,6 +3727,81 @@
                 <w:color w:val="202124"/>
                 <w:sz w:val="18"/>
               </w:rPr>
+              <w:t>Correo</w:t>
+            </w:r>
+          </w:p>
+        </w:tc>
+        <w:tc>
+          <w:tcPr>
+            <w:tcW w:type="dxa" w:w="6760"/>
+            <w:shd w:fill="FFFFFF"/>
+            <w:tcBorders>
+              <w:top w:val="single" w:sz="4" w:color="DADCE0"/>
+              <w:left w:val="single" w:sz="4" w:color="DADCE0"/>
+              <w:bottom w:val="single" w:sz="4" w:color="DADCE0"/>
+              <w:right w:val="single" w:sz="4" w:color="DADCE0"/>
+              <w:insideH w:val="single" w:sz="4" w:color="DADCE0"/>
+              <w:insideV w:val="single" w:sz="4" w:color="DADCE0"/>
+            </w:tcBorders>
+            <w:vAlign w:val="center"/>
+            <w:tcMar>
+              <w:top w:type="dxa" w:w="80"/>
+              <w:bottom w:type="dxa" w:w="80"/>
+              <w:start w:type="dxa" w:w="120"/>
+              <w:end w:type="dxa" w:w="120"/>
+            </w:tcMar>
+          </w:tcPr>
+          <w:p>
+            <w:pPr>
+              <w:spacing w:after="0" w:line="240" w:lineRule="auto"/>
+            </w:pPr>
+            <w:r>
+              <w:rPr>
+                <w:rFonts w:ascii="Calibri" w:hAnsi="Calibri"/>
+                <w:b w:val="0"/>
+                <w:i w:val="0"/>
+                <w:color w:val="202124"/>
+                <w:sz w:val="18"/>
+              </w:rPr>
+              <w:t>Resend y dominio joinsclee.com</w:t>
+            </w:r>
+          </w:p>
+        </w:tc>
+      </w:tr>
+      <w:tr>
+        <w:trPr/>
+        <w:tc>
+          <w:tcPr>
+            <w:tcW w:type="dxa" w:w="2600"/>
+            <w:shd w:fill="F5F7FA"/>
+            <w:tcBorders>
+              <w:top w:val="single" w:sz="4" w:color="DADCE0"/>
+              <w:left w:val="single" w:sz="4" w:color="DADCE0"/>
+              <w:bottom w:val="single" w:sz="4" w:color="DADCE0"/>
+              <w:right w:val="single" w:sz="4" w:color="DADCE0"/>
+              <w:insideH w:val="single" w:sz="4" w:color="DADCE0"/>
+              <w:insideV w:val="single" w:sz="4" w:color="DADCE0"/>
+            </w:tcBorders>
+            <w:vAlign w:val="center"/>
+            <w:tcMar>
+              <w:top w:type="dxa" w:w="80"/>
+              <w:bottom w:type="dxa" w:w="80"/>
+              <w:start w:type="dxa" w:w="120"/>
+              <w:end w:type="dxa" w:w="120"/>
+            </w:tcMar>
+          </w:tcPr>
+          <w:p>
+            <w:pPr>
+              <w:spacing w:after="0" w:line="240" w:lineRule="auto"/>
+            </w:pPr>
+            <w:r>
+              <w:rPr>
+                <w:rFonts w:ascii="Calibri" w:hAnsi="Calibri"/>
+                <w:b w:val="0"/>
+                <w:i w:val="0"/>
+                <w:color w:val="202124"/>
+                <w:sz w:val="18"/>
+              </w:rPr>
               <w:t>Validación</w:t>
             </w:r>
           </w:p>
@@ -3584,7 +3809,7 @@
         <w:tc>
           <w:tcPr>
             <w:tcW w:type="dxa" w:w="6760"/>
-            <w:shd w:fill="FFFFFF"/>
+            <w:shd w:fill="F5F7FA"/>
             <w:tcBorders>
               <w:top w:val="single" w:sz="4" w:color="DADCE0"/>
               <w:left w:val="single" w:sz="4" w:color="DADCE0"/>
@@ -3623,7 +3848,7 @@
         <w:tc>
           <w:tcPr>
             <w:tcW w:type="dxa" w:w="2600"/>
-            <w:shd w:fill="F5F7FA"/>
+            <w:shd w:fill="FFFFFF"/>
             <w:tcBorders>
               <w:top w:val="single" w:sz="4" w:color="DADCE0"/>
               <w:left w:val="single" w:sz="4" w:color="DADCE0"/>
@@ -3659,7 +3884,7 @@
         <w:tc>
           <w:tcPr>
             <w:tcW w:type="dxa" w:w="6760"/>
-            <w:shd w:fill="F5F7FA"/>
+            <w:shd w:fill="FFFFFF"/>
             <w:tcBorders>
               <w:top w:val="single" w:sz="4" w:color="DADCE0"/>
               <w:left w:val="single" w:sz="4" w:color="DADCE0"/>
@@ -3698,7 +3923,7 @@
         <w:tc>
           <w:tcPr>
             <w:tcW w:type="dxa" w:w="2600"/>
-            <w:shd w:fill="FFFFFF"/>
+            <w:shd w:fill="F5F7FA"/>
             <w:tcBorders>
               <w:top w:val="single" w:sz="4" w:color="DADCE0"/>
               <w:left w:val="single" w:sz="4" w:color="DADCE0"/>
@@ -3734,7 +3959,7 @@
         <w:tc>
           <w:tcPr>
             <w:tcW w:type="dxa" w:w="6760"/>
-            <w:shd w:fill="FFFFFF"/>
+            <w:shd w:fill="F5F7FA"/>
             <w:tcBorders>
               <w:top w:val="single" w:sz="4" w:color="DADCE0"/>
               <w:left w:val="single" w:sz="4" w:color="DADCE0"/>
@@ -3773,7 +3998,7 @@
         <w:tc>
           <w:tcPr>
             <w:tcW w:type="dxa" w:w="2600"/>
-            <w:shd w:fill="F5F7FA"/>
+            <w:shd w:fill="FFFFFF"/>
             <w:tcBorders>
               <w:top w:val="single" w:sz="4" w:color="DADCE0"/>
               <w:left w:val="single" w:sz="4" w:color="DADCE0"/>
@@ -3809,7 +4034,7 @@
         <w:tc>
           <w:tcPr>
             <w:tcW w:type="dxa" w:w="6760"/>
-            <w:shd w:fill="F5F7FA"/>
+            <w:shd w:fill="FFFFFF"/>
             <w:tcBorders>
               <w:top w:val="single" w:sz="4" w:color="DADCE0"/>
               <w:left w:val="single" w:sz="4" w:color="DADCE0"/>
@@ -3848,7 +4073,7 @@
         <w:tc>
           <w:tcPr>
             <w:tcW w:type="dxa" w:w="2600"/>
-            <w:shd w:fill="FFFFFF"/>
+            <w:shd w:fill="F5F7FA"/>
             <w:tcBorders>
               <w:top w:val="single" w:sz="4" w:color="DADCE0"/>
               <w:left w:val="single" w:sz="4" w:color="DADCE0"/>
@@ -3884,7 +4109,7 @@
         <w:tc>
           <w:tcPr>
             <w:tcW w:type="dxa" w:w="6760"/>
-            <w:shd w:fill="FFFFFF"/>
+            <w:shd w:fill="F5F7FA"/>
             <w:tcBorders>
               <w:top w:val="single" w:sz="4" w:color="DADCE0"/>
               <w:left w:val="single" w:sz="4" w:color="DADCE0"/>
@@ -3923,7 +4148,7 @@
         <w:tc>
           <w:tcPr>
             <w:tcW w:type="dxa" w:w="2600"/>
-            <w:shd w:fill="F5F7FA"/>
+            <w:shd w:fill="FFFFFF"/>
             <w:tcBorders>
               <w:top w:val="single" w:sz="4" w:color="DADCE0"/>
               <w:left w:val="single" w:sz="4" w:color="DADCE0"/>
@@ -3959,7 +4184,7 @@
         <w:tc>
           <w:tcPr>
             <w:tcW w:type="dxa" w:w="6760"/>
-            <w:shd w:fill="F5F7FA"/>
+            <w:shd w:fill="FFFFFF"/>
             <w:tcBorders>
               <w:top w:val="single" w:sz="4" w:color="DADCE0"/>
               <w:left w:val="single" w:sz="4" w:color="DADCE0"/>
@@ -4208,7 +4433,7 @@
         <w:pStyle w:val="Heading1"/>
       </w:pPr>
       <w:r>
-        <w:t>5. Ruta de 71% a 80%</w:t>
+        <w:t>5. Ruta de 73% a 80%</w:t>
       </w:r>
     </w:p>
     <w:p>
@@ -4231,7 +4456,7 @@
           <w:color w:val="202124"/>
           <w:sz w:val="22"/>
         </w:rPr>
-        <w:t>Aprobar Resend, verificar dominio y configurar las cuatro variables.</w:t>
+        <w:t>Ejecutar un canary dirigido a una cuenta autorizada.</w:t>
       </w:r>
     </w:p>
     <w:p>
@@ -4246,7 +4471,7 @@
           <w:color w:val="202124"/>
           <w:sz w:val="22"/>
         </w:rPr>
-        <w:t>Crear el trabajo semanal en EasyPanel.</w:t>
+        <w:t>Revisar el destinatario y habilitar el trabajo semanal.</w:t>
       </w:r>
     </w:p>
     <w:p>
@@ -4261,7 +4486,7 @@
           <w:color w:val="202124"/>
           <w:sz w:val="22"/>
         </w:rPr>
-        <w:t>Ejecutar un envío controlado y verificar historial, deduplicación y reintentos.</w:t>
+        <w:t>Monitorear el primer ciclo automático y su historial de entregas.</w:t>
       </w:r>
     </w:p>
     <w:p>
@@ -4872,7 +5097,7 @@
                 <w:color w:val="202124"/>
                 <w:sz w:val="17"/>
               </w:rPr>
-              <w:t>Cuenta, dominio y API key</w:t>
+              <w:t>Ejecutar canary dirigido</w:t>
             </w:r>
           </w:p>
         </w:tc>
@@ -4908,7 +5133,7 @@
                 <w:color w:val="202124"/>
                 <w:sz w:val="17"/>
               </w:rPr>
-              <w:t>Adaptador listo</w:t>
+              <w:t>Dominio, secretos y despliegue listos</w:t>
             </w:r>
           </w:p>
         </w:tc>
@@ -4983,7 +5208,7 @@
                 <w:color w:val="202124"/>
                 <w:sz w:val="17"/>
               </w:rPr>
-              <w:t>Secreto y horario</w:t>
+              <w:t>Validar y habilitar</w:t>
             </w:r>
           </w:p>
         </w:tc>
@@ -5019,7 +5244,7 @@
                 <w:color w:val="202124"/>
                 <w:sz w:val="17"/>
               </w:rPr>
-              <w:t>Endpoint listo</w:t>
+              <w:t>Trabajo semanal desplegado</w:t>
             </w:r>
           </w:p>
         </w:tc>
@@ -5491,7 +5716,7 @@
                 <w:color w:val="202124"/>
                 <w:sz w:val="20"/>
               </w:rPr>
-              <w:t>Sin estas variables la alerta se guarda, pero la aplicación informa que el correo sigue pendiente. El proceso devuelve 503 y no marca entregas falsas.</w:t>
+              <w:t>Las variables ya están guardadas en EasyPanel. El trabajo semanal permanece deshabilitado en Supabase hasta revisar el destinatario y completar el canary.</w:t>
             </w:r>
           </w:p>
         </w:tc>
@@ -5550,7 +5775,7 @@
           <w:color w:val="202124"/>
           <w:sz w:val="22"/>
         </w:rPr>
-        <w:t>Que las alertas ya llegan a correos reales.</w:t>
+        <w:t>Que las alertas semanales ya están activadas para usuarios reales.</w:t>
       </w:r>
     </w:p>
     <w:p>
@@ -6423,7 +6648,7 @@
           <w:color w:val="202124"/>
           <w:sz w:val="22"/>
         </w:rPr>
-        <w:t>No desplegar este corte hasta aprobar el texto comercial, configurar el primer canal externo y repetir el smoke test local. Después puede publicarse mediante PR y despliegue controlado.</w:t>
+        <w:t>El corte ya está desplegado. El siguiente control es ejecutar un canary dirigido y habilitar el trabajo semanal solo después de revisar el destinatario.</w:t>
       </w:r>
     </w:p>
     <w:sectPr>
@@ -6475,7 +6700,7 @@
               <w:color w:val="5F6368"/>
               <w:sz w:val="16"/>
             </w:rPr>
-            <w:t>Radar CRECE · 24 jul 2026</w:t>
+            <w:t>Radar CRECE · 25 jul 2026</w:t>
           </w:r>
         </w:p>
       </w:tc>

</xml_diff>